<commit_message>
Update SPTJM formatting: vertical align colons, ordered list, left indent
</commit_message>
<xml_diff>
--- a/_usulan_tpp_smkn1_koba/PNS/SURAT_PERNYATAAN_PNS.docx
+++ b/_usulan_tpp_smkn1_koba/PNS/SURAT_PERNYATAAN_PNS.docx
@@ -32,6 +32,9 @@
     </w:p>
     <w:p>
       <w:pPr>
+        <w:tabs>
+          <w:tab w:pos="2551" w:val="left"/>
+        </w:tabs>
         <w:spacing w:after="60" w:before="0"/>
         <w:jc w:val="left"/>
       </w:pPr>
@@ -42,12 +45,36 @@
           <w:sz w:val="22"/>
         </w:rPr>
         <w:t>Nama</w:t>
+      </w:r>
+      <w:r>
+        <w:rPr>
+          <w:rFonts w:ascii="Arial" w:hAnsi="Arial"/>
+          <w:sz w:val="22"/>
+        </w:rPr>
         <w:tab/>
-        <w:t>: SYAHRYANTO, S.T.,M.Pd</w:t>
+      </w:r>
+      <w:r>
+        <w:rPr>
+          <w:rFonts w:ascii="Arial" w:hAnsi="Arial"/>
+          <w:b w:val="0"/>
+          <w:sz w:val="22"/>
+        </w:rPr>
+        <w:t xml:space="preserve">: </w:t>
+      </w:r>
+      <w:r>
+        <w:rPr>
+          <w:rFonts w:ascii="Arial" w:hAnsi="Arial"/>
+          <w:b w:val="0"/>
+          <w:sz w:val="22"/>
+        </w:rPr>
+        <w:t>SYAHRYANTO, S.T.,M.Pd</w:t>
       </w:r>
     </w:p>
     <w:p>
       <w:pPr>
+        <w:tabs>
+          <w:tab w:pos="2551" w:val="left"/>
+        </w:tabs>
         <w:spacing w:after="60" w:before="0"/>
         <w:jc w:val="left"/>
       </w:pPr>
@@ -58,12 +85,36 @@
           <w:sz w:val="22"/>
         </w:rPr>
         <w:t>NIP</w:t>
+      </w:r>
+      <w:r>
+        <w:rPr>
+          <w:rFonts w:ascii="Arial" w:hAnsi="Arial"/>
+          <w:sz w:val="22"/>
+        </w:rPr>
         <w:tab/>
-        <w:t>: 197708262006041005</w:t>
+      </w:r>
+      <w:r>
+        <w:rPr>
+          <w:rFonts w:ascii="Arial" w:hAnsi="Arial"/>
+          <w:b w:val="0"/>
+          <w:sz w:val="22"/>
+        </w:rPr>
+        <w:t xml:space="preserve">: </w:t>
+      </w:r>
+      <w:r>
+        <w:rPr>
+          <w:rFonts w:ascii="Arial" w:hAnsi="Arial"/>
+          <w:b w:val="0"/>
+          <w:sz w:val="22"/>
+        </w:rPr>
+        <w:t>197708262006041005</w:t>
       </w:r>
     </w:p>
     <w:p>
       <w:pPr>
+        <w:tabs>
+          <w:tab w:pos="2551" w:val="left"/>
+        </w:tabs>
         <w:spacing w:after="240" w:before="0"/>
         <w:jc w:val="left"/>
       </w:pPr>
@@ -74,8 +125,29 @@
           <w:sz w:val="22"/>
         </w:rPr>
         <w:t>Jabatan</w:t>
+      </w:r>
+      <w:r>
+        <w:rPr>
+          <w:rFonts w:ascii="Arial" w:hAnsi="Arial"/>
+          <w:sz w:val="22"/>
+        </w:rPr>
         <w:tab/>
-        <w:t>: Kepala SMK Negeri 1 Koba</w:t>
+      </w:r>
+      <w:r>
+        <w:rPr>
+          <w:rFonts w:ascii="Arial" w:hAnsi="Arial"/>
+          <w:b w:val="0"/>
+          <w:sz w:val="22"/>
+        </w:rPr>
+        <w:t xml:space="preserve">: </w:t>
+      </w:r>
+      <w:r>
+        <w:rPr>
+          <w:rFonts w:ascii="Arial" w:hAnsi="Arial"/>
+          <w:b w:val="0"/>
+          <w:sz w:val="22"/>
+        </w:rPr>
+        <w:t>Kepala SMK Negeri 1 Koba</w:t>
       </w:r>
     </w:p>
     <w:p>
@@ -94,13 +166,12 @@
     </w:p>
     <w:p>
       <w:pPr>
+        <w:pStyle w:val="ListNumber"/>
         <w:spacing w:after="120" w:before="0"/>
-        <w:jc w:val="left"/>
       </w:pPr>
       <w:r>
         <w:rPr>
           <w:rFonts w:ascii="Arial" w:hAnsi="Arial"/>
-          <w:b w:val="0"/>
           <w:sz w:val="22"/>
         </w:rPr>
         <w:t>1.</w:t>
@@ -110,13 +181,12 @@
     </w:p>
     <w:p>
       <w:pPr>
+        <w:pStyle w:val="ListNumber"/>
         <w:spacing w:after="120" w:before="0"/>
-        <w:jc w:val="left"/>
       </w:pPr>
       <w:r>
         <w:rPr>
           <w:rFonts w:ascii="Arial" w:hAnsi="Arial"/>
-          <w:b w:val="0"/>
           <w:sz w:val="22"/>
         </w:rPr>
         <w:t>2.</w:t>
@@ -126,13 +196,12 @@
     </w:p>
     <w:p>
       <w:pPr>
+        <w:pStyle w:val="ListNumber"/>
         <w:spacing w:after="240" w:before="0"/>
-        <w:jc w:val="left"/>
       </w:pPr>
       <w:r>
         <w:rPr>
           <w:rFonts w:ascii="Arial" w:hAnsi="Arial"/>
-          <w:b w:val="0"/>
           <w:sz w:val="22"/>
         </w:rPr>
         <w:t>3.</w:t>
@@ -143,6 +212,7 @@
     <w:p>
       <w:pPr>
         <w:spacing w:after="120" w:before="0"/>
+        <w:ind w:left="7000"/>
         <w:jc w:val="left"/>
       </w:pPr>
       <w:r>
@@ -157,6 +227,7 @@
     <w:p>
       <w:pPr>
         <w:spacing w:after="720" w:before="0"/>
+        <w:ind w:left="7000"/>
         <w:jc w:val="left"/>
       </w:pPr>
       <w:r>
@@ -171,6 +242,7 @@
     <w:p>
       <w:pPr>
         <w:spacing w:after="60" w:before="0"/>
+        <w:ind w:left="7000"/>
         <w:jc w:val="left"/>
       </w:pPr>
       <w:r>
@@ -185,6 +257,7 @@
     <w:p>
       <w:pPr>
         <w:spacing w:after="60" w:before="0"/>
+        <w:ind w:left="7000"/>
         <w:jc w:val="left"/>
       </w:pPr>
       <w:r>

</xml_diff>

<commit_message>
Fix duplicate numbering, set 150px padding-left, justify items
</commit_message>
<xml_diff>
--- a/_usulan_tpp_smkn1_koba/PNS/SURAT_PERNYATAAN_PNS.docx
+++ b/_usulan_tpp_smkn1_koba/PNS/SURAT_PERNYATAAN_PNS.docx
@@ -168,14 +168,14 @@
       <w:pPr>
         <w:pStyle w:val="ListNumber"/>
         <w:spacing w:after="120" w:before="0"/>
+        <w:ind w:left="3000"/>
+        <w:jc w:val="both"/>
       </w:pPr>
       <w:r>
         <w:rPr>
           <w:rFonts w:ascii="Arial" w:hAnsi="Arial"/>
           <w:sz w:val="22"/>
         </w:rPr>
-        <w:t>1.</w:t>
-        <w:tab/>
         <w:t>Perhitungan yang terdapat dalam SPM Langsung (SPM-LS) Nomor : ........................................... tanggal .......................................... untuk pembayaran Tambahan Penghasilan Pegawai (TPP) Negeri Sipil sebesar Rp.51.609.933,- (SPM-LS) untuk bulan Juli 2026 telah dihitung dengan benar berdasarkan dokumen pelaksanaan anggaran dan dokumen pendukung lainnya.</w:t>
       </w:r>
     </w:p>
@@ -183,14 +183,14 @@
       <w:pPr>
         <w:pStyle w:val="ListNumber"/>
         <w:spacing w:after="120" w:before="0"/>
+        <w:ind w:left="3000"/>
+        <w:jc w:val="both"/>
       </w:pPr>
       <w:r>
         <w:rPr>
           <w:rFonts w:ascii="Arial" w:hAnsi="Arial"/>
           <w:sz w:val="22"/>
         </w:rPr>
-        <w:t>2.</w:t>
-        <w:tab/>
         <w:t>Apabila terdapat kesalahan dan kelebihan atas pembayaran, sebagaimana yang dimaksud pada point 1 (satu), kami bertanggung jawab dan bersedia untuk menyetorkan kelebihan tersebut ke Kas Daerah.</w:t>
       </w:r>
     </w:p>
@@ -198,21 +198,21 @@
       <w:pPr>
         <w:pStyle w:val="ListNumber"/>
         <w:spacing w:after="240" w:before="0"/>
+        <w:ind w:left="3000"/>
+        <w:jc w:val="both"/>
       </w:pPr>
       <w:r>
         <w:rPr>
           <w:rFonts w:ascii="Arial" w:hAnsi="Arial"/>
           <w:sz w:val="22"/>
         </w:rPr>
-        <w:t>3.</w:t>
-        <w:tab/>
         <w:t>Dokumen bukti-bukti belanja atas pembayaran tersebut di atas disimpan di Dinas Pendidikan Provinsi Kepulauan Bangka Belitung (SMK Negeri 1 Koba) sesuai ketentuan yang berlaku untuk kelengkapan administrasi dan keperluan pemeriksaan BPK dan/atau aparatur pengawas fungsional lainnya.</w:t>
       </w:r>
     </w:p>
     <w:p>
       <w:pPr>
         <w:spacing w:after="120" w:before="0"/>
-        <w:ind w:left="7000"/>
+        <w:ind w:left="3000"/>
         <w:jc w:val="left"/>
       </w:pPr>
       <w:r>
@@ -227,7 +227,7 @@
     <w:p>
       <w:pPr>
         <w:spacing w:after="720" w:before="0"/>
-        <w:ind w:left="7000"/>
+        <w:ind w:left="3000"/>
         <w:jc w:val="left"/>
       </w:pPr>
       <w:r>
@@ -242,7 +242,7 @@
     <w:p>
       <w:pPr>
         <w:spacing w:after="60" w:before="0"/>
-        <w:ind w:left="7000"/>
+        <w:ind w:left="3000"/>
         <w:jc w:val="left"/>
       </w:pPr>
       <w:r>
@@ -257,7 +257,7 @@
     <w:p>
       <w:pPr>
         <w:spacing w:after="60" w:before="0"/>
-        <w:ind w:left="7000"/>
+        <w:ind w:left="3000"/>
         <w:jc w:val="left"/>
       </w:pPr>
       <w:r>

</xml_diff>

<commit_message>
Merge signature name+NIP into single paragraph with line break
</commit_message>
<xml_diff>
--- a/_usulan_tpp_smkn1_koba/PNS/SURAT_PERNYATAAN_PNS.docx
+++ b/_usulan_tpp_smkn1_koba/PNS/SURAT_PERNYATAAN_PNS.docx
@@ -168,7 +168,6 @@
       <w:pPr>
         <w:pStyle w:val="ListNumber"/>
         <w:spacing w:after="120" w:before="0"/>
-        <w:ind w:left="3000"/>
         <w:jc w:val="both"/>
       </w:pPr>
       <w:r>
@@ -183,7 +182,6 @@
       <w:pPr>
         <w:pStyle w:val="ListNumber"/>
         <w:spacing w:after="120" w:before="0"/>
-        <w:ind w:left="3000"/>
         <w:jc w:val="both"/>
       </w:pPr>
       <w:r>
@@ -198,7 +196,6 @@
       <w:pPr>
         <w:pStyle w:val="ListNumber"/>
         <w:spacing w:after="240" w:before="0"/>
-        <w:ind w:left="3000"/>
         <w:jc w:val="both"/>
       </w:pPr>
       <w:r>
@@ -212,7 +209,7 @@
     <w:p>
       <w:pPr>
         <w:spacing w:after="120" w:before="0"/>
-        <w:ind w:left="3000"/>
+        <w:ind w:left="4000"/>
         <w:jc w:val="left"/>
       </w:pPr>
       <w:r>
@@ -227,7 +224,7 @@
     <w:p>
       <w:pPr>
         <w:spacing w:after="720" w:before="0"/>
-        <w:ind w:left="3000"/>
+        <w:ind w:left="4000"/>
         <w:jc w:val="left"/>
       </w:pPr>
       <w:r>
@@ -242,7 +239,7 @@
     <w:p>
       <w:pPr>
         <w:spacing w:after="60" w:before="0"/>
-        <w:ind w:left="3000"/>
+        <w:ind w:left="4000"/>
         <w:jc w:val="left"/>
       </w:pPr>
       <w:r>
@@ -257,7 +254,7 @@
     <w:p>
       <w:pPr>
         <w:spacing w:after="60" w:before="0"/>
-        <w:ind w:left="3000"/>
+        <w:ind w:left="4000"/>
         <w:jc w:val="left"/>
       </w:pPr>
       <w:r>

</xml_diff>

<commit_message>
Fix terbilang extraction: target parentheses after Rp. amount
</commit_message>
<xml_diff>
--- a/_usulan_tpp_smkn1_koba/PNS/SURAT_PERNYATAAN_PNS.docx
+++ b/_usulan_tpp_smkn1_koba/PNS/SURAT_PERNYATAAN_PNS.docx
@@ -175,7 +175,7 @@
           <w:rFonts w:ascii="Arial" w:hAnsi="Arial"/>
           <w:sz w:val="22"/>
         </w:rPr>
-        <w:t>Perhitungan yang terdapat dalam SPM Langsung (SPM-LS) Nomor : ........................................... tanggal .......................................... untuk pembayaran Tambahan Penghasilan Pegawai (TPP) Negeri Sipil sebesar Rp.51.609.933,- (SPM-LS) untuk bulan Juli 2026 telah dihitung dengan benar berdasarkan dokumen pelaksanaan anggaran dan dokumen pendukung lainnya.</w:t>
+        <w:t>Perhitungan yang terdapat dalam SPM Langsung (SPM-LS) Nomor : ........................................... tanggal .......................................... untuk pembayaran Tambahan Penghasilan Pegawai (TPP) Negeri Sipil sebesar Rp.51.609.933,- (lima puluh satu juta enam ratus sembilan ribu sembilan ratus tiga puluh tiga rupiah) untuk bulan Juli 2026 telah dihitung dengan benar berdasarkan dokumen pelaksanaan anggaran dan dokumen pendukung lainnya.</w:t>
       </w:r>
     </w:p>
     <w:p>
@@ -240,7 +240,6 @@
       <w:pPr>
         <w:spacing w:after="60" w:before="0"/>
         <w:ind w:left="4000"/>
-        <w:jc w:val="left"/>
       </w:pPr>
       <w:r>
         <w:rPr>
@@ -249,18 +248,11 @@
           <w:sz w:val="22"/>
         </w:rPr>
         <w:t>SYAHRYANTO, S.T.,M.Pd</w:t>
+        <w:br/>
       </w:r>
-    </w:p>
-    <w:p>
-      <w:pPr>
-        <w:spacing w:after="60" w:before="0"/>
-        <w:ind w:left="4000"/>
-        <w:jc w:val="left"/>
-      </w:pPr>
       <w:r>
         <w:rPr>
           <w:rFonts w:ascii="Arial" w:hAnsi="Arial"/>
-          <w:b w:val="0"/>
           <w:sz w:val="22"/>
         </w:rPr>
         <w:t>NIP. 197708262006041005</w:t>

</xml_diff>

<commit_message>
Add kop_surat image at top of generated SPTJM document
</commit_message>
<xml_diff>
--- a/_usulan_tpp_smkn1_koba/PNS/SURAT_PERNYATAAN_PNS.docx
+++ b/_usulan_tpp_smkn1_koba/PNS/SURAT_PERNYATAAN_PNS.docx
@@ -2,6 +2,46 @@
 <file path=word/document.xml><?xml version="1.0" encoding="utf-8"?>
 <w:document xmlns:wpc="http://schemas.microsoft.com/office/word/2010/wordprocessingCanvas" xmlns:mo="http://schemas.microsoft.com/office/mac/office/2008/main" xmlns:mc="http://schemas.openxmlformats.org/markup-compatibility/2006" xmlns:mv="urn:schemas-microsoft-com:mac:vml" xmlns:o="urn:schemas-microsoft-com:office:office" xmlns:r="http://schemas.openxmlformats.org/officeDocument/2006/relationships" xmlns:m="http://schemas.openxmlformats.org/officeDocument/2006/math" xmlns:v="urn:schemas-microsoft-com:vml" xmlns:wp14="http://schemas.microsoft.com/office/word/2010/wordprocessingDrawing" xmlns:wp="http://schemas.openxmlformats.org/drawingml/2006/wordprocessingDrawing" xmlns:w10="urn:schemas-microsoft-com:office:word" xmlns:w="http://schemas.openxmlformats.org/wordprocessingml/2006/main" xmlns:w14="http://schemas.microsoft.com/office/word/2010/wordml" xmlns:wpg="http://schemas.microsoft.com/office/word/2010/wordprocessingGroup" xmlns:wpi="http://schemas.microsoft.com/office/word/2010/wordprocessingInk" xmlns:wne="http://schemas.microsoft.com/office/word/2006/wordml" xmlns:wps="http://schemas.microsoft.com/office/word/2010/wordprocessingShape" mc:Ignorable="w14 wp14">
   <w:body>
+    <w:p>
+      <w:pPr>
+        <w:spacing w:after="120"/>
+        <w:jc w:val="center"/>
+      </w:pPr>
+      <w:r>
+        <w:drawing>
+          <wp:inline xmlns:a="http://schemas.openxmlformats.org/drawingml/2006/main" xmlns:pic="http://schemas.openxmlformats.org/drawingml/2006/picture">
+            <wp:extent cx="5760720" cy="1115554"/>
+            <wp:docPr id="1" name="Picture 1"/>
+            <wp:cNvGraphicFramePr>
+              <a:graphicFrameLocks noChangeAspect="1"/>
+            </wp:cNvGraphicFramePr>
+            <a:graphic>
+              <a:graphicData uri="http://schemas.openxmlformats.org/drawingml/2006/picture">
+                <pic:pic>
+                  <pic:nvPicPr>
+                    <pic:cNvPr id="0" name="kop_surat.png"/>
+                    <pic:cNvPicPr/>
+                  </pic:nvPicPr>
+                  <pic:blipFill>
+                    <a:blip r:embed="rId9"/>
+                    <a:stretch>
+                      <a:fillRect/>
+                    </a:stretch>
+                  </pic:blipFill>
+                  <pic:spPr>
+                    <a:xfrm>
+                      <a:off x="0" y="0"/>
+                      <a:ext cx="5760720" cy="1115554"/>
+                    </a:xfrm>
+                    <a:prstGeom prst="rect"/>
+                  </pic:spPr>
+                </pic:pic>
+              </a:graphicData>
+            </a:graphic>
+          </wp:inline>
+        </w:drawing>
+      </w:r>
+    </w:p>
     <w:p>
       <w:pPr>
         <w:spacing w:after="240" w:before="0"/>
@@ -175,7 +215,7 @@
           <w:rFonts w:ascii="Arial" w:hAnsi="Arial"/>
           <w:sz w:val="22"/>
         </w:rPr>
-        <w:t>Perhitungan yang terdapat dalam SPM Langsung (SPM-LS) Nomor : ........................................... tanggal .......................................... untuk pembayaran Tambahan Penghasilan Pegawai (TPP) Negeri Sipil sebesar Rp.51.609.933,- (lima puluh satu juta enam ratus sembilan ribu sembilan ratus tiga puluh tiga rupiah) untuk bulan Juli 2026 telah dihitung dengan benar berdasarkan dokumen pelaksanaan anggaran dan dokumen pendukung lainnya.</w:t>
+        <w:t>Perhitungan yang terdapat dalam SPM Langsung (SPM-LS) Nomor : ........................................... tanggal .......................................... untuk pembayaran Tambahan Penghasilan Pegawai (TPP) Negeri Sipil sebesar Rp.51.609.933,- (lima puluh satu juta enam ratus sembilan ribu sembilan ratus tiga puluh tiga rupiah) untuk bulan Agustus 2026 telah dihitung dengan benar berdasarkan dokumen pelaksanaan anggaran dan dokumen pendukung lainnya.</w:t>
       </w:r>
     </w:p>
     <w:p>
@@ -195,7 +235,7 @@
     <w:p>
       <w:pPr>
         <w:pStyle w:val="ListNumber"/>
-        <w:spacing w:after="240" w:before="0"/>
+        <w:spacing w:after="480" w:before="0"/>
         <w:jc w:val="both"/>
       </w:pPr>
       <w:r>
@@ -218,7 +258,7 @@
           <w:b w:val="0"/>
           <w:sz w:val="22"/>
         </w:rPr>
-        <w:t>Koba,        Agustus 2026</w:t>
+        <w:t>Koba,        September 2026</w:t>
       </w:r>
     </w:p>
     <w:p>

</xml_diff>

<commit_message>
Fix kop_surat embedding: use JPEG, adjust width to 5.8in
</commit_message>
<xml_diff>
--- a/_usulan_tpp_smkn1_koba/PNS/SURAT_PERNYATAAN_PNS.docx
+++ b/_usulan_tpp_smkn1_koba/PNS/SURAT_PERNYATAAN_PNS.docx
@@ -10,7 +10,7 @@
       <w:r>
         <w:drawing>
           <wp:inline xmlns:a="http://schemas.openxmlformats.org/drawingml/2006/main" xmlns:pic="http://schemas.openxmlformats.org/drawingml/2006/picture">
-            <wp:extent cx="5760720" cy="1115554"/>
+            <wp:extent cx="5303520" cy="1027018"/>
             <wp:docPr id="1" name="Picture 1"/>
             <wp:cNvGraphicFramePr>
               <a:graphicFrameLocks noChangeAspect="1"/>
@@ -19,7 +19,7 @@
               <a:graphicData uri="http://schemas.openxmlformats.org/drawingml/2006/picture">
                 <pic:pic>
                   <pic:nvPicPr>
-                    <pic:cNvPr id="0" name="kop_surat.png"/>
+                    <pic:cNvPr id="0" name="kop_surat.jpg"/>
                     <pic:cNvPicPr/>
                   </pic:nvPicPr>
                   <pic:blipFill>
@@ -31,7 +31,7 @@
                   <pic:spPr>
                     <a:xfrm>
                       <a:off x="0" y="0"/>
-                      <a:ext cx="5760720" cy="1115554"/>
+                      <a:ext cx="5303520" cy="1027018"/>
                     </a:xfrm>
                     <a:prstGeom prst="rect"/>
                   </pic:spPr>

</xml_diff>

<commit_message>
Add empty paragraphs between numbered items for reliable spacing
</commit_message>
<xml_diff>
--- a/_usulan_tpp_smkn1_koba/PNS/SURAT_PERNYATAAN_PNS.docx
+++ b/_usulan_tpp_smkn1_koba/PNS/SURAT_PERNYATAAN_PNS.docx
@@ -207,7 +207,7 @@
     <w:p>
       <w:pPr>
         <w:pStyle w:val="ListNumber"/>
-        <w:spacing w:after="120" w:before="0"/>
+        <w:spacing w:after="0" w:before="0"/>
         <w:jc w:val="both"/>
       </w:pPr>
       <w:r>
@@ -220,8 +220,13 @@
     </w:p>
     <w:p>
       <w:pPr>
+        <w:spacing w:after="480" w:before="0"/>
+      </w:pPr>
+    </w:p>
+    <w:p>
+      <w:pPr>
         <w:pStyle w:val="ListNumber"/>
-        <w:spacing w:after="120" w:before="0"/>
+        <w:spacing w:after="0" w:before="0"/>
         <w:jc w:val="both"/>
       </w:pPr>
       <w:r>
@@ -234,8 +239,13 @@
     </w:p>
     <w:p>
       <w:pPr>
+        <w:spacing w:after="480" w:before="0"/>
+      </w:pPr>
+    </w:p>
+    <w:p>
+      <w:pPr>
         <w:pStyle w:val="ListNumber"/>
-        <w:spacing w:after="480" w:before="0"/>
+        <w:spacing w:after="0" w:before="0"/>
         <w:jc w:val="both"/>
       </w:pPr>
       <w:r>
@@ -245,6 +255,11 @@
         </w:rPr>
         <w:t>Dokumen bukti-bukti belanja atas pembayaran tersebut di atas disimpan di Dinas Pendidikan Provinsi Kepulauan Bangka Belitung (SMK Negeri 1 Koba) sesuai ketentuan yang berlaku untuk kelengkapan administrasi dan keperluan pemeriksaan BPK dan/atau aparatur pengawas fungsional lainnya.</w:t>
       </w:r>
+    </w:p>
+    <w:p>
+      <w:pPr>
+        <w:spacing w:after="480" w:before="0"/>
+      </w:pPr>
     </w:p>
     <w:p>
       <w:pPr>

</xml_diff>

<commit_message>
Set item spacing to 12pt without empty paragraphs
</commit_message>
<xml_diff>
--- a/_usulan_tpp_smkn1_koba/PNS/SURAT_PERNYATAAN_PNS.docx
+++ b/_usulan_tpp_smkn1_koba/PNS/SURAT_PERNYATAAN_PNS.docx
@@ -207,7 +207,7 @@
     <w:p>
       <w:pPr>
         <w:pStyle w:val="ListNumber"/>
-        <w:spacing w:after="0" w:before="0"/>
+        <w:spacing w:after="240" w:before="0"/>
         <w:jc w:val="both"/>
       </w:pPr>
       <w:r>
@@ -220,13 +220,8 @@
     </w:p>
     <w:p>
       <w:pPr>
-        <w:spacing w:after="480" w:before="0"/>
-      </w:pPr>
-    </w:p>
-    <w:p>
-      <w:pPr>
         <w:pStyle w:val="ListNumber"/>
-        <w:spacing w:after="0" w:before="0"/>
+        <w:spacing w:after="240" w:before="0"/>
         <w:jc w:val="both"/>
       </w:pPr>
       <w:r>
@@ -239,13 +234,8 @@
     </w:p>
     <w:p>
       <w:pPr>
-        <w:spacing w:after="480" w:before="0"/>
-      </w:pPr>
-    </w:p>
-    <w:p>
-      <w:pPr>
         <w:pStyle w:val="ListNumber"/>
-        <w:spacing w:after="0" w:before="0"/>
+        <w:spacing w:after="240" w:before="0"/>
         <w:jc w:val="both"/>
       </w:pPr>
       <w:r>
@@ -255,11 +245,6 @@
         </w:rPr>
         <w:t>Dokumen bukti-bukti belanja atas pembayaran tersebut di atas disimpan di Dinas Pendidikan Provinsi Kepulauan Bangka Belitung (SMK Negeri 1 Koba) sesuai ketentuan yang berlaku untuk kelengkapan administrasi dan keperluan pemeriksaan BPK dan/atau aparatur pengawas fungsional lainnya.</w:t>
       </w:r>
-    </w:p>
-    <w:p>
-      <w:pPr>
-        <w:spacing w:after="480" w:before="0"/>
-      </w:pPr>
     </w:p>
     <w:p>
       <w:pPr>

</xml_diff>